<commit_message>
Onyx Remote: a window dragged on the PC is put at the same place on the Pi (kapi v96 kapi_win_move)
- Elegant: EL_OP_WIN_MOVE (any window by its id, its client area's place); AppKit kapi_win_move
- rdpd: CAPS says protocol 2; the client's MOVE (9: u32 id, s16 x y) moves the Pi's window
- Onyx Remote: a window dragged by its title bar (Onyx frame or native, ResizeEnd) sends MOVE
  to an rdpd of protocol 2 (an older one: as before); pc/dist/OnyxRemote.exe rebuilt
- the rdpd protocol test checks CAPS 2 and MOVE; docs 02 (v96), 03, 04, AppKit's reference

Co-Authored-By: Claude Opus 5.5 <noreply@anthropic.com>
Claude-Session: https://claude.ai/code/session_01UmzXYNxuMx9BrSexvySWBo
</commit_message>
<xml_diff>
--- a/docs/exports/10-APPKIT.docx
+++ b/docs/exports/10-APPKIT.docx
@@ -393,7 +393,7 @@
               <w:t xml:space="preserve"> </w:t>
             </w:r>
             <w:r>
-              <w:t xml:space="preserve">— 313 entries in its table (</w:t>
+              <w:t xml:space="preserve">— 314 entries in its table (</w:t>
             </w:r>
             <w:r>
               <w:rPr>
@@ -9921,6 +9921,50 @@
               <w:rPr>
                 <w:rStyle w:val="VerbatimChar"/>
               </w:rPr>
+              <w:t xml:space="preserve">kapi_win_move</w:t>
+            </w:r>
+          </w:p>
+        </w:tc>
+        <w:tc>
+          <w:tcPr/>
+          <w:p>
+            <w:pPr>
+              <w:pStyle w:val="Compact"/>
+              <w:jc w:val="left"/>
+            </w:pPr>
+            <w:r>
+              <w:t xml:space="preserve">(v96) A window moved</w:t>
+            </w:r>
+          </w:p>
+        </w:tc>
+        <w:tc>
+          <w:tcPr/>
+          <w:p>
+            <w:pPr>
+              <w:pStyle w:val="Compact"/>
+              <w:jc w:val="left"/>
+            </w:pPr>
+            <w:r>
+              <w:rPr>
+                <w:rStyle w:val="VerbatimChar"/>
+              </w:rPr>
+              <w:t xml:space="preserve">appkit.h</w:t>
+            </w:r>
+          </w:p>
+        </w:tc>
+      </w:tr>
+      <w:tr>
+        <w:tc>
+          <w:tcPr/>
+          <w:p>
+            <w:pPr>
+              <w:pStyle w:val="Compact"/>
+              <w:jc w:val="left"/>
+            </w:pPr>
+            <w:r>
+              <w:rPr>
+                <w:rStyle w:val="VerbatimChar"/>
+              </w:rPr>
               <w:t xml:space="preserve">kapi_pop_event</w:t>
             </w:r>
           </w:p>
@@ -35109,6 +35153,103 @@
           <w:rStyle w:val="NormalTok"/>
         </w:rPr>
         <w:t xml:space="preserve"> kind</w:t>
+      </w:r>
+      <w:r>
+        <w:rPr>
+          <w:rStyle w:val="OperatorTok"/>
+        </w:rPr>
+        <w:t xml:space="preserve">);</w:t>
+      </w:r>
+    </w:p>
+    <w:p>
+      <w:pPr>
+        <w:pStyle w:val="FirstParagraph"/>
+      </w:pPr>
+      <w:r>
+        <w:t xml:space="preserve">(v96) A window moved: id (kapi_win_list's; 0 the caller's), its client area's top left to x, y on the screen -&gt; 0, -1 (no such window, a topmost or backmost one). The remote desktop's (rdpd: a window dragged on the PC).</w:t>
+      </w:r>
+    </w:p>
+    <w:p>
+      <w:pPr>
+        <w:pStyle w:val="SourceCode"/>
+      </w:pPr>
+      <w:r>
+        <w:rPr>
+          <w:rStyle w:val="DataTypeTok"/>
+        </w:rPr>
+        <w:t xml:space="preserve">int</w:t>
+      </w:r>
+      <w:r>
+        <w:rPr>
+          <w:rStyle w:val="NormalTok"/>
+        </w:rPr>
+        <w:t xml:space="preserve"> kapi_win_move </w:t>
+      </w:r>
+      <w:r>
+        <w:rPr>
+          <w:rStyle w:val="OperatorTok"/>
+        </w:rPr>
+        <w:t xml:space="preserve">(</w:t>
+      </w:r>
+      <w:r>
+        <w:rPr>
+          <w:rStyle w:val="DataTypeTok"/>
+        </w:rPr>
+        <w:t xml:space="preserve">unsigned</w:t>
+      </w:r>
+      <w:r>
+        <w:rPr>
+          <w:rStyle w:val="NormalTok"/>
+        </w:rPr>
+        <w:t xml:space="preserve"> id</w:t>
+      </w:r>
+      <w:r>
+        <w:rPr>
+          <w:rStyle w:val="OperatorTok"/>
+        </w:rPr>
+        <w:t xml:space="preserve">,</w:t>
+      </w:r>
+      <w:r>
+        <w:rPr>
+          <w:rStyle w:val="NormalTok"/>
+        </w:rPr>
+        <w:t xml:space="preserve"> </w:t>
+      </w:r>
+      <w:r>
+        <w:rPr>
+          <w:rStyle w:val="DataTypeTok"/>
+        </w:rPr>
+        <w:t xml:space="preserve">int</w:t>
+      </w:r>
+      <w:r>
+        <w:rPr>
+          <w:rStyle w:val="NormalTok"/>
+        </w:rPr>
+        <w:t xml:space="preserve"> x</w:t>
+      </w:r>
+      <w:r>
+        <w:rPr>
+          <w:rStyle w:val="OperatorTok"/>
+        </w:rPr>
+        <w:t xml:space="preserve">,</w:t>
+      </w:r>
+      <w:r>
+        <w:rPr>
+          <w:rStyle w:val="NormalTok"/>
+        </w:rPr>
+        <w:t xml:space="preserve"> </w:t>
+      </w:r>
+      <w:r>
+        <w:rPr>
+          <w:rStyle w:val="DataTypeTok"/>
+        </w:rPr>
+        <w:t xml:space="preserve">int</w:t>
+      </w:r>
+      <w:r>
+        <w:rPr>
+          <w:rStyle w:val="NormalTok"/>
+        </w:rPr>
+        <w:t xml:space="preserve"> y</w:t>
       </w:r>
       <w:r>
         <w:rPr>

</xml_diff>

<commit_message>
PocketUI P1: kapi v97 -- lib_open_as (the alias), the server chosen by shell=, KAPI_WS_SWITCH
K1: kapi_lib_open_as (slot 234): the graphics server loads a library under
an alias (SD:/lib/uikit.so) that the library cache looks up first; the
alias lives with its server (orphaned at its end, taken over on a
relaunch, dropped when another server starts); preload/unload show it.
K2: system.ini shell= chooses the server (desktop: Elegant as before;
pocket, console: SD:/bin/pocketui --mode <m>), Elegant as the fallback so
the screen never stays dark. K3: KAPI_WS_SWITCH ends the server and starts
the one shell= names. Elegant ends on KAPI_WS_IN_QUIT. aliastest (Pi test),
the image test's alias cases (617 checks). docs 02, 03, 04, 10, HANDOFF.

Co-Authored-By: Claude Opus 5.5 <noreply@anthropic.com>
Claude-Session: https://claude.ai/code/session_01Rso9E1gr5271FnTGcMLUVZ
</commit_message>
<xml_diff>
--- a/docs/exports/10-APPKIT.docx
+++ b/docs/exports/10-APPKIT.docx
@@ -393,7 +393,7 @@
               <w:t xml:space="preserve"> </w:t>
             </w:r>
             <w:r>
-              <w:t xml:space="preserve">— 314 entries in its table (</w:t>
+              <w:t xml:space="preserve">— 315 entries in its table (</w:t>
             </w:r>
             <w:r>
               <w:rPr>
@@ -12957,6 +12957,50 @@
               <w:rPr>
                 <w:rStyle w:val="VerbatimChar"/>
               </w:rPr>
+              <w:t xml:space="preserve">kapi_lib_open_as</w:t>
+            </w:r>
+          </w:p>
+        </w:tc>
+        <w:tc>
+          <w:tcPr/>
+          <w:p>
+            <w:pPr>
+              <w:pStyle w:val="Compact"/>
+              <w:jc w:val="left"/>
+            </w:pPr>
+            <w:r>
+              <w:t xml:space="preserve">(v97) The graphics server's own library under another name (docs/POCKETUI-TECH-STUDY.md section 3)</w:t>
+            </w:r>
+          </w:p>
+        </w:tc>
+        <w:tc>
+          <w:tcPr/>
+          <w:p>
+            <w:pPr>
+              <w:pStyle w:val="Compact"/>
+              <w:jc w:val="left"/>
+            </w:pPr>
+            <w:r>
+              <w:rPr>
+                <w:rStyle w:val="VerbatimChar"/>
+              </w:rPr>
+              <w:t xml:space="preserve">appkit.h</w:t>
+            </w:r>
+          </w:p>
+        </w:tc>
+      </w:tr>
+      <w:tr>
+        <w:tc>
+          <w:tcPr/>
+          <w:p>
+            <w:pPr>
+              <w:pStyle w:val="Compact"/>
+              <w:jc w:val="left"/>
+            </w:pPr>
+            <w:r>
+              <w:rPr>
+                <w:rStyle w:val="VerbatimChar"/>
+              </w:rPr>
               <w:t xml:space="preserve">kapi_sound_output</w:t>
             </w:r>
           </w:p>
@@ -42587,6 +42631,241 @@
           <w:rStyle w:val="NormalTok"/>
         </w:rPr>
         <w:t xml:space="preserve">name</w:t>
+      </w:r>
+      <w:r>
+        <w:rPr>
+          <w:rStyle w:val="OperatorTok"/>
+        </w:rPr>
+        <w:t xml:space="preserve">,</w:t>
+      </w:r>
+      <w:r>
+        <w:rPr>
+          <w:rStyle w:val="NormalTok"/>
+        </w:rPr>
+        <w:t xml:space="preserve"> </w:t>
+      </w:r>
+      <w:r>
+        <w:rPr>
+          <w:rStyle w:val="DataTypeTok"/>
+        </w:rPr>
+        <w:t xml:space="preserve">unsigned</w:t>
+      </w:r>
+      <w:r>
+        <w:rPr>
+          <w:rStyle w:val="NormalTok"/>
+        </w:rPr>
+        <w:t xml:space="preserve"> min_version</w:t>
+      </w:r>
+      <w:r>
+        <w:rPr>
+          <w:rStyle w:val="OperatorTok"/>
+        </w:rPr>
+        <w:t xml:space="preserve">,</w:t>
+      </w:r>
+      <w:r>
+        <w:rPr>
+          <w:rStyle w:val="NormalTok"/>
+        </w:rPr>
+        <w:t xml:space="preserve"> </w:t>
+      </w:r>
+      <w:r>
+        <w:rPr>
+          <w:rStyle w:val="DataTypeTok"/>
+        </w:rPr>
+        <w:t xml:space="preserve">int</w:t>
+      </w:r>
+      <w:r>
+        <w:rPr>
+          <w:rStyle w:val="NormalTok"/>
+        </w:rPr>
+        <w:t xml:space="preserve"> </w:t>
+      </w:r>
+      <w:r>
+        <w:rPr>
+          <w:rStyle w:val="OperatorTok"/>
+        </w:rPr>
+        <w:t xml:space="preserve">*</w:t>
+      </w:r>
+      <w:r>
+        <w:rPr>
+          <w:rStyle w:val="NormalTok"/>
+        </w:rPr>
+        <w:t xml:space="preserve">err</w:t>
+      </w:r>
+      <w:r>
+        <w:rPr>
+          <w:rStyle w:val="OperatorTok"/>
+        </w:rPr>
+        <w:t xml:space="preserve">);</w:t>
+      </w:r>
+    </w:p>
+    <w:p>
+      <w:pPr>
+        <w:pStyle w:val="FirstParagraph"/>
+      </w:pPr>
+      <w:r>
+        <w:t xml:space="preserve">(v97) The graphics server's own library under another name (docs/POCKETUI-TECH-STUDY.md section 3):</w:t>
+      </w:r>
+      <w:r>
+        <w:t xml:space="preserve"> </w:t>
+      </w:r>
+      <w:r>
+        <w:rPr>
+          <w:rStyle w:val="VerbatimChar"/>
+        </w:rPr>
+        <w:t xml:space="preserve">path</w:t>
+      </w:r>
+      <w:r>
+        <w:t xml:space="preserve"> </w:t>
+      </w:r>
+      <w:r>
+        <w:t xml:space="preserve">opened and mapped as kapi_lib_open does (its version checked against min_version), and from now on every kapi_lib_open of</w:t>
+      </w:r>
+      <w:r>
+        <w:t xml:space="preserve"> </w:t>
+      </w:r>
+      <w:r>
+        <w:rPr>
+          <w:rStyle w:val="VerbatimChar"/>
+        </w:rPr>
+        <w:t xml:space="preserve">alias</w:t>
+      </w:r>
+      <w:r>
+        <w:t xml:space="preserve"> </w:t>
+      </w:r>
+      <w:r>
+        <w:t xml:space="preserve">-- any process's, a program's bind of "uikit" -- gets it, before a library whose real path is alias (PocketUI: kapi_lib_open_as ("SD:/lib/pocket/uikit.so", "SD:/lib/uikit.so", n, &amp;err)). Only the process holding the graphics server's role (call it after KAPI_WS_REGISTER, before KAPI_WS_DISPLAY: every program of the session then finds the alias); both names under SD:/lib/, never SD:/lib/appkit.so. -&gt; its export table; 0 with *err = -KAPI_EPERM (not the server, or a name refused), -KAPI_EBUSY (alias another live process's, or the caller's on another library), -KAPI_EINVAL (path = alias), kapi_lib_open's errors, -KAPI_ENOSYS on a kernel before v97. Asked again: the same table. The alias lives while the server or a program holds the library: the server ended, it is kept for the same server started again; another server started, it is dropped.</w:t>
+      </w:r>
+    </w:p>
+    <w:p>
+      <w:pPr>
+        <w:pStyle w:val="SourceCode"/>
+      </w:pPr>
+      <w:r>
+        <w:rPr>
+          <w:rStyle w:val="AttributeTok"/>
+        </w:rPr>
+        <w:t xml:space="preserve">const</w:t>
+      </w:r>
+      <w:r>
+        <w:rPr>
+          <w:rStyle w:val="NormalTok"/>
+        </w:rPr>
+        <w:t xml:space="preserve"> </w:t>
+      </w:r>
+      <w:r>
+        <w:rPr>
+          <w:rStyle w:val="DataTypeTok"/>
+        </w:rPr>
+        <w:t xml:space="preserve">void</w:t>
+      </w:r>
+      <w:r>
+        <w:rPr>
+          <w:rStyle w:val="NormalTok"/>
+        </w:rPr>
+        <w:t xml:space="preserve"> </w:t>
+      </w:r>
+      <w:r>
+        <w:rPr>
+          <w:rStyle w:val="OperatorTok"/>
+        </w:rPr>
+        <w:t xml:space="preserve">*</w:t>
+      </w:r>
+      <w:r>
+        <w:rPr>
+          <w:rStyle w:val="NormalTok"/>
+        </w:rPr>
+        <w:t xml:space="preserve"> kapi_lib_open_as </w:t>
+      </w:r>
+      <w:r>
+        <w:rPr>
+          <w:rStyle w:val="OperatorTok"/>
+        </w:rPr>
+        <w:t xml:space="preserve">(</w:t>
+      </w:r>
+      <w:r>
+        <w:rPr>
+          <w:rStyle w:val="AttributeTok"/>
+        </w:rPr>
+        <w:t xml:space="preserve">const</w:t>
+      </w:r>
+      <w:r>
+        <w:rPr>
+          <w:rStyle w:val="NormalTok"/>
+        </w:rPr>
+        <w:t xml:space="preserve"> </w:t>
+      </w:r>
+      <w:r>
+        <w:rPr>
+          <w:rStyle w:val="DataTypeTok"/>
+        </w:rPr>
+        <w:t xml:space="preserve">char</w:t>
+      </w:r>
+      <w:r>
+        <w:rPr>
+          <w:rStyle w:val="NormalTok"/>
+        </w:rPr>
+        <w:t xml:space="preserve"> </w:t>
+      </w:r>
+      <w:r>
+        <w:rPr>
+          <w:rStyle w:val="OperatorTok"/>
+        </w:rPr>
+        <w:t xml:space="preserve">*</w:t>
+      </w:r>
+      <w:r>
+        <w:rPr>
+          <w:rStyle w:val="NormalTok"/>
+        </w:rPr>
+        <w:t xml:space="preserve">path</w:t>
+      </w:r>
+      <w:r>
+        <w:rPr>
+          <w:rStyle w:val="OperatorTok"/>
+        </w:rPr>
+        <w:t xml:space="preserve">,</w:t>
+      </w:r>
+      <w:r>
+        <w:rPr>
+          <w:rStyle w:val="NormalTok"/>
+        </w:rPr>
+        <w:t xml:space="preserve"> </w:t>
+      </w:r>
+      <w:r>
+        <w:rPr>
+          <w:rStyle w:val="AttributeTok"/>
+        </w:rPr>
+        <w:t xml:space="preserve">const</w:t>
+      </w:r>
+      <w:r>
+        <w:rPr>
+          <w:rStyle w:val="NormalTok"/>
+        </w:rPr>
+        <w:t xml:space="preserve"> </w:t>
+      </w:r>
+      <w:r>
+        <w:rPr>
+          <w:rStyle w:val="DataTypeTok"/>
+        </w:rPr>
+        <w:t xml:space="preserve">char</w:t>
+      </w:r>
+      <w:r>
+        <w:rPr>
+          <w:rStyle w:val="NormalTok"/>
+        </w:rPr>
+        <w:t xml:space="preserve"> </w:t>
+      </w:r>
+      <w:r>
+        <w:rPr>
+          <w:rStyle w:val="OperatorTok"/>
+        </w:rPr>
+        <w:t xml:space="preserve">*</w:t>
+      </w:r>
+      <w:r>
+        <w:rPr>
+          <w:rStyle w:val="NormalTok"/>
+        </w:rPr>
+        <w:t xml:space="preserve">alias</w:t>
       </w:r>
       <w:r>
         <w:rPr>

</xml_diff>